<commit_message>
618 finalised assessment and submitted
</commit_message>
<xml_diff>
--- a/2026-T3/B1-ICTICT618-ManageIP_ethic_privacy/Task2/files-and-docs/2-Action_plan.docx
+++ b/2026-T3/B1-ICTICT618-ManageIP_ethic_privacy/Task2/files-and-docs/2-Action_plan.docx
@@ -52,25 +52,7 @@
           <w:color w:val="20374B"/>
           <w:shd w:val="clear" w:color="auto" w:fill="FFFFFF"/>
         </w:rPr>
-        <w:t>Activities in o</w:t>
-      </w:r>
-      <w:r>
-        <w:rPr>
-          <w:rStyle w:val="Strong"/>
-          <w:rFonts w:ascii="Roboto" w:hAnsi="Roboto"/>
-          <w:color w:val="20374B"/>
-          <w:shd w:val="clear" w:color="auto" w:fill="FFFFFF"/>
-        </w:rPr>
-        <w:t>rder of priority</w:t>
-      </w:r>
-      <w:r>
-        <w:rPr>
-          <w:rStyle w:val="Strong"/>
-          <w:rFonts w:ascii="Roboto" w:hAnsi="Roboto"/>
-          <w:color w:val="20374B"/>
-          <w:shd w:val="clear" w:color="auto" w:fill="FFFFFF"/>
-        </w:rPr>
-        <w:t xml:space="preserve"> with scrum style:</w:t>
+        <w:t>Activities in order of priority with scrum style:</w:t>
       </w:r>
     </w:p>
     <w:p>
@@ -99,9 +81,9 @@
       </w:tblPr>
       <w:tblGrid>
         <w:gridCol w:w="2784"/>
-        <w:gridCol w:w="4013"/>
+        <w:gridCol w:w="4012"/>
         <w:gridCol w:w="934"/>
-        <w:gridCol w:w="1285"/>
+        <w:gridCol w:w="1286"/>
       </w:tblGrid>
       <w:tr>
         <w:trPr>
@@ -111,7 +93,7 @@
         <w:tc>
           <w:tcPr>
             <w:cnfStyle w:val="001000000100" w:firstRow="0" w:lastRow="0" w:firstColumn="1" w:lastColumn="0" w:oddVBand="0" w:evenVBand="0" w:oddHBand="0" w:evenHBand="0" w:firstRowFirstColumn="1" w:firstRowLastColumn="0" w:lastRowFirstColumn="0" w:lastRowLastColumn="0"/>
-            <w:tcW w:w="626" w:type="pct"/>
+            <w:tcW w:w="1544" w:type="pct"/>
             <w:tcBorders>
               <w:bottom w:val="none" w:sz="0" w:space="0" w:color="auto"/>
               <w:right w:val="none" w:sz="0" w:space="0" w:color="auto"/>
@@ -126,7 +108,7 @@
         </w:tc>
         <w:tc>
           <w:tcPr>
-            <w:tcW w:w="3228" w:type="pct"/>
+            <w:tcW w:w="2225" w:type="pct"/>
             <w:tcBorders>
               <w:bottom w:val="none" w:sz="0" w:space="0" w:color="auto"/>
             </w:tcBorders>
@@ -143,7 +125,7 @@
         </w:tc>
         <w:tc>
           <w:tcPr>
-            <w:tcW w:w="547" w:type="pct"/>
+            <w:tcW w:w="518" w:type="pct"/>
             <w:tcBorders>
               <w:bottom w:val="none" w:sz="0" w:space="0" w:color="auto"/>
             </w:tcBorders>
@@ -160,7 +142,7 @@
         </w:tc>
         <w:tc>
           <w:tcPr>
-            <w:tcW w:w="599" w:type="pct"/>
+            <w:tcW w:w="713" w:type="pct"/>
             <w:tcBorders>
               <w:bottom w:val="none" w:sz="0" w:space="0" w:color="auto"/>
             </w:tcBorders>
@@ -184,7 +166,7 @@
         <w:tc>
           <w:tcPr>
             <w:cnfStyle w:val="001000000000" w:firstRow="0" w:lastRow="0" w:firstColumn="1" w:lastColumn="0" w:oddVBand="0" w:evenVBand="0" w:oddHBand="0" w:evenHBand="0" w:firstRowFirstColumn="0" w:firstRowLastColumn="0" w:lastRowFirstColumn="0" w:lastRowLastColumn="0"/>
-            <w:tcW w:w="626" w:type="pct"/>
+            <w:tcW w:w="1544" w:type="pct"/>
             <w:tcBorders>
               <w:right w:val="none" w:sz="0" w:space="0" w:color="auto"/>
             </w:tcBorders>
@@ -198,7 +180,7 @@
         </w:tc>
         <w:tc>
           <w:tcPr>
-            <w:tcW w:w="3228" w:type="pct"/>
+            <w:tcW w:w="2225" w:type="pct"/>
             <w:hideMark/>
           </w:tcPr>
           <w:p>
@@ -223,7 +205,7 @@
         </w:tc>
         <w:tc>
           <w:tcPr>
-            <w:tcW w:w="547" w:type="pct"/>
+            <w:tcW w:w="518" w:type="pct"/>
             <w:hideMark/>
           </w:tcPr>
           <w:p>
@@ -237,7 +219,7 @@
         </w:tc>
         <w:tc>
           <w:tcPr>
-            <w:tcW w:w="599" w:type="pct"/>
+            <w:tcW w:w="713" w:type="pct"/>
             <w:hideMark/>
           </w:tcPr>
           <w:p>
@@ -257,7 +239,7 @@
         <w:tc>
           <w:tcPr>
             <w:cnfStyle w:val="001000000000" w:firstRow="0" w:lastRow="0" w:firstColumn="1" w:lastColumn="0" w:oddVBand="0" w:evenVBand="0" w:oddHBand="0" w:evenHBand="0" w:firstRowFirstColumn="0" w:firstRowLastColumn="0" w:lastRowFirstColumn="0" w:lastRowLastColumn="0"/>
-            <w:tcW w:w="626" w:type="pct"/>
+            <w:tcW w:w="1544" w:type="pct"/>
             <w:tcBorders>
               <w:right w:val="none" w:sz="0" w:space="0" w:color="auto"/>
             </w:tcBorders>
@@ -271,7 +253,7 @@
         </w:tc>
         <w:tc>
           <w:tcPr>
-            <w:tcW w:w="3228" w:type="pct"/>
+            <w:tcW w:w="2225" w:type="pct"/>
             <w:hideMark/>
           </w:tcPr>
           <w:p>
@@ -296,7 +278,7 @@
         </w:tc>
         <w:tc>
           <w:tcPr>
-            <w:tcW w:w="547" w:type="pct"/>
+            <w:tcW w:w="518" w:type="pct"/>
             <w:hideMark/>
           </w:tcPr>
           <w:p>
@@ -310,7 +292,7 @@
         </w:tc>
         <w:tc>
           <w:tcPr>
-            <w:tcW w:w="599" w:type="pct"/>
+            <w:tcW w:w="713" w:type="pct"/>
             <w:hideMark/>
           </w:tcPr>
           <w:p>
@@ -331,23 +313,21 @@
         <w:tc>
           <w:tcPr>
             <w:cnfStyle w:val="001000000000" w:firstRow="0" w:lastRow="0" w:firstColumn="1" w:lastColumn="0" w:oddVBand="0" w:evenVBand="0" w:oddHBand="0" w:evenHBand="0" w:firstRowFirstColumn="0" w:firstRowLastColumn="0" w:lastRowFirstColumn="0" w:lastRowLastColumn="0"/>
-            <w:tcW w:w="626" w:type="pct"/>
-            <w:tcBorders>
-              <w:right w:val="none" w:sz="0" w:space="0" w:color="auto"/>
-            </w:tcBorders>
-            <w:hideMark/>
+            <w:tcW w:w="1544" w:type="pct"/>
           </w:tcPr>
           <w:p>
             <w:r>
               <w:lastRenderedPageBreak/>
-              <w:t>Sprint Review: Submit updated policies and Grievance Procedure to Management for final approval.</w:t>
-            </w:r>
-          </w:p>
-        </w:tc>
-        <w:tc>
-          <w:tcPr>
-            <w:tcW w:w="3228" w:type="pct"/>
-            <w:hideMark/>
+              <w:t>Sprint 2 additional update: Review digital security and backup procedures based on trainer feedback</w:t>
+            </w:r>
+            <w:r>
+              <w:t>.</w:t>
+            </w:r>
+          </w:p>
+        </w:tc>
+        <w:tc>
+          <w:tcPr>
+            <w:tcW w:w="2225" w:type="pct"/>
           </w:tcPr>
           <w:p>
             <w:pPr>
@@ -362,50 +342,48 @@
                 <w:b/>
                 <w:bCs/>
               </w:rPr>
-              <w:t>Definition of Done (DoD):</w:t>
-            </w:r>
-            <w:r>
-              <w:t xml:space="preserve"> As per company guidelines, management's final approval will be requested and confirmed via email.</w:t>
-            </w:r>
-          </w:p>
-        </w:tc>
-        <w:tc>
-          <w:tcPr>
-            <w:tcW w:w="547" w:type="pct"/>
-            <w:hideMark/>
+              <w:t xml:space="preserve">Divya </w:t>
+            </w:r>
+            <w:r>
+              <w:t>suggested that the USB-based backup process should be updated to ensure consistency with the company’s privacy and security procedures. The backup process was updated to remove routine USB backups and require approved encrypted corporate backup systems or secure cloud storage.</w:t>
+            </w:r>
+          </w:p>
+        </w:tc>
+        <w:tc>
+          <w:tcPr>
+            <w:tcW w:w="518" w:type="pct"/>
           </w:tcPr>
           <w:p>
             <w:pPr>
               <w:cnfStyle w:val="000000100000" w:firstRow="0" w:lastRow="0" w:firstColumn="0" w:lastColumn="0" w:oddVBand="0" w:evenVBand="0" w:oddHBand="1" w:evenHBand="0" w:firstRowFirstColumn="0" w:firstRowLastColumn="0" w:lastRowFirstColumn="0" w:lastRowLastColumn="0"/>
             </w:pPr>
             <w:r>
-              <w:t>End of Month 1</w:t>
-            </w:r>
-          </w:p>
-        </w:tc>
-        <w:tc>
-          <w:tcPr>
-            <w:tcW w:w="599" w:type="pct"/>
-            <w:hideMark/>
+              <w:t>Week 4</w:t>
+            </w:r>
+          </w:p>
+        </w:tc>
+        <w:tc>
+          <w:tcPr>
+            <w:tcW w:w="713" w:type="pct"/>
           </w:tcPr>
           <w:p>
             <w:pPr>
               <w:cnfStyle w:val="000000100000" w:firstRow="0" w:lastRow="0" w:firstColumn="0" w:lastColumn="0" w:oddVBand="0" w:evenVBand="0" w:oddHBand="1" w:evenHBand="0" w:firstRowFirstColumn="0" w:firstRowLastColumn="0" w:lastRowFirstColumn="0" w:lastRowLastColumn="0"/>
             </w:pPr>
             <w:r>
-              <w:t>In-progress</w:t>
+              <w:t>Completed</w:t>
             </w:r>
           </w:p>
         </w:tc>
       </w:tr>
       <w:tr>
         <w:trPr>
-          <w:trHeight w:val="4100"/>
+          <w:trHeight w:val="4780"/>
         </w:trPr>
         <w:tc>
           <w:tcPr>
             <w:cnfStyle w:val="001000000000" w:firstRow="0" w:lastRow="0" w:firstColumn="1" w:lastColumn="0" w:oddVBand="0" w:evenVBand="0" w:oddHBand="0" w:evenHBand="0" w:firstRowFirstColumn="0" w:firstRowLastColumn="0" w:lastRowFirstColumn="0" w:lastRowLastColumn="0"/>
-            <w:tcW w:w="626" w:type="pct"/>
+            <w:tcW w:w="1544" w:type="pct"/>
             <w:tcBorders>
               <w:right w:val="none" w:sz="0" w:space="0" w:color="auto"/>
             </w:tcBorders>
@@ -413,27 +391,38 @@
           </w:tcPr>
           <w:p>
             <w:r>
-              <w:t>Sprint 3: Create presentation materials and conduct a staff training/information session.</w:t>
-            </w:r>
-          </w:p>
-        </w:tc>
-        <w:tc>
-          <w:tcPr>
-            <w:tcW w:w="3228" w:type="pct"/>
+              <w:t>Sprint Review: Submit updated policies and Grievance Procedure to Management for final approval.</w:t>
+            </w:r>
+          </w:p>
+        </w:tc>
+        <w:tc>
+          <w:tcPr>
+            <w:tcW w:w="2225" w:type="pct"/>
             <w:hideMark/>
           </w:tcPr>
           <w:p>
             <w:pPr>
               <w:cnfStyle w:val="000000000000" w:firstRow="0" w:lastRow="0" w:firstColumn="0" w:lastColumn="0" w:oddVBand="0" w:evenVBand="0" w:oddHBand="0" w:evenHBand="0" w:firstRowFirstColumn="0" w:firstRowLastColumn="0" w:lastRowFirstColumn="0" w:lastRowLastColumn="0"/>
-            </w:pPr>
-            <w:r>
-              <w:t>Hold a round-table session. Gather feedback from the team regarding the new IP, privacy, and ethics procedures.</w:t>
-            </w:r>
-          </w:p>
-        </w:tc>
-        <w:tc>
-          <w:tcPr>
-            <w:tcW w:w="547" w:type="pct"/>
+              <w:rPr>
+                <w:b/>
+                <w:bCs/>
+              </w:rPr>
+            </w:pPr>
+            <w:r>
+              <w:rPr>
+                <w:b/>
+                <w:bCs/>
+              </w:rPr>
+              <w:t>Definition of Done (DoD):</w:t>
+            </w:r>
+            <w:r>
+              <w:t xml:space="preserve"> As per company guidelines, management's final approval will be requested and confirmed via email.</w:t>
+            </w:r>
+          </w:p>
+        </w:tc>
+        <w:tc>
+          <w:tcPr>
+            <w:tcW w:w="518" w:type="pct"/>
             <w:hideMark/>
           </w:tcPr>
           <w:p>
@@ -441,13 +430,13 @@
               <w:cnfStyle w:val="000000000000" w:firstRow="0" w:lastRow="0" w:firstColumn="0" w:lastColumn="0" w:oddVBand="0" w:evenVBand="0" w:oddHBand="0" w:evenHBand="0" w:firstRowFirstColumn="0" w:firstRowLastColumn="0" w:lastRowFirstColumn="0" w:lastRowLastColumn="0"/>
             </w:pPr>
             <w:r>
-              <w:t>Month 2</w:t>
-            </w:r>
-          </w:p>
-        </w:tc>
-        <w:tc>
-          <w:tcPr>
-            <w:tcW w:w="599" w:type="pct"/>
+              <w:t>End of Month 1</w:t>
+            </w:r>
+          </w:p>
+        </w:tc>
+        <w:tc>
+          <w:tcPr>
+            <w:tcW w:w="713" w:type="pct"/>
             <w:hideMark/>
           </w:tcPr>
           <w:p>
@@ -468,7 +457,7 @@
         <w:tc>
           <w:tcPr>
             <w:cnfStyle w:val="001000000000" w:firstRow="0" w:lastRow="0" w:firstColumn="1" w:lastColumn="0" w:oddVBand="0" w:evenVBand="0" w:oddHBand="0" w:evenHBand="0" w:firstRowFirstColumn="0" w:firstRowLastColumn="0" w:lastRowFirstColumn="0" w:lastRowLastColumn="0"/>
-            <w:tcW w:w="626" w:type="pct"/>
+            <w:tcW w:w="1544" w:type="pct"/>
             <w:tcBorders>
               <w:right w:val="none" w:sz="0" w:space="0" w:color="auto"/>
             </w:tcBorders>
@@ -476,13 +465,13 @@
           </w:tcPr>
           <w:p>
             <w:r>
-              <w:t>Sprint 4: Upload all approved documents to the secure corporate file-sharing system.</w:t>
-            </w:r>
-          </w:p>
-        </w:tc>
-        <w:tc>
-          <w:tcPr>
-            <w:tcW w:w="3228" w:type="pct"/>
+              <w:t>Sprint 3: Create presentation materials and conduct a staff training/information session.</w:t>
+            </w:r>
+          </w:p>
+        </w:tc>
+        <w:tc>
+          <w:tcPr>
+            <w:tcW w:w="2225" w:type="pct"/>
             <w:hideMark/>
           </w:tcPr>
           <w:p>
@@ -490,13 +479,13 @@
               <w:cnfStyle w:val="000000100000" w:firstRow="0" w:lastRow="0" w:firstColumn="0" w:lastColumn="0" w:oddVBand="0" w:evenVBand="0" w:oddHBand="1" w:evenHBand="0" w:firstRowFirstColumn="0" w:firstRowLastColumn="0" w:lastRowFirstColumn="0" w:lastRowLastColumn="0"/>
             </w:pPr>
             <w:r>
-              <w:t>Verify that the system (cloud Drive/Intranet) is highly secure, confidential, and accessible only to authorised staff.</w:t>
-            </w:r>
-          </w:p>
-        </w:tc>
-        <w:tc>
-          <w:tcPr>
-            <w:tcW w:w="547" w:type="pct"/>
+              <w:t>Hold a round-table session. Gather feedback from the team regarding the new IP, privacy, and ethics procedures.</w:t>
+            </w:r>
+          </w:p>
+        </w:tc>
+        <w:tc>
+          <w:tcPr>
+            <w:tcW w:w="518" w:type="pct"/>
             <w:hideMark/>
           </w:tcPr>
           <w:p>
@@ -510,7 +499,7 @@
         </w:tc>
         <w:tc>
           <w:tcPr>
-            <w:tcW w:w="599" w:type="pct"/>
+            <w:tcW w:w="713" w:type="pct"/>
             <w:hideMark/>
           </w:tcPr>
           <w:p>
@@ -518,19 +507,19 @@
               <w:cnfStyle w:val="000000100000" w:firstRow="0" w:lastRow="0" w:firstColumn="0" w:lastColumn="0" w:oddVBand="0" w:evenVBand="0" w:oddHBand="1" w:evenHBand="0" w:firstRowFirstColumn="0" w:firstRowLastColumn="0" w:lastRowFirstColumn="0" w:lastRowLastColumn="0"/>
             </w:pPr>
             <w:r>
-              <w:t>No</w:t>
+              <w:t>In-progress</w:t>
             </w:r>
           </w:p>
         </w:tc>
       </w:tr>
       <w:tr>
         <w:trPr>
-          <w:trHeight w:val="4440"/>
+          <w:trHeight w:val="4100"/>
         </w:trPr>
         <w:tc>
           <w:tcPr>
             <w:cnfStyle w:val="001000000000" w:firstRow="0" w:lastRow="0" w:firstColumn="1" w:lastColumn="0" w:oddVBand="0" w:evenVBand="0" w:oddHBand="0" w:evenHBand="0" w:firstRowFirstColumn="0" w:firstRowLastColumn="0" w:lastRowFirstColumn="0" w:lastRowLastColumn="0"/>
-            <w:tcW w:w="626" w:type="pct"/>
+            <w:tcW w:w="1544" w:type="pct"/>
             <w:tcBorders>
               <w:right w:val="none" w:sz="0" w:space="0" w:color="auto"/>
             </w:tcBorders>
@@ -539,13 +528,13 @@
           <w:p>
             <w:r>
               <w:lastRenderedPageBreak/>
-              <w:t>Epic 1: Quarterly compliance audit.</w:t>
-            </w:r>
-          </w:p>
-        </w:tc>
-        <w:tc>
-          <w:tcPr>
-            <w:tcW w:w="3228" w:type="pct"/>
+              <w:t>Sprint 4: Upload all approved documents to the secure corporate file-sharing system.</w:t>
+            </w:r>
+          </w:p>
+        </w:tc>
+        <w:tc>
+          <w:tcPr>
+            <w:tcW w:w="2225" w:type="pct"/>
             <w:hideMark/>
           </w:tcPr>
           <w:p>
@@ -553,13 +542,13 @@
               <w:cnfStyle w:val="000000000000" w:firstRow="0" w:lastRow="0" w:firstColumn="0" w:lastColumn="0" w:oddVBand="0" w:evenVBand="0" w:oddHBand="0" w:evenHBand="0" w:firstRowFirstColumn="0" w:firstRowLastColumn="0" w:lastRowFirstColumn="0" w:lastRowLastColumn="0"/>
             </w:pPr>
             <w:r>
-              <w:t>Conduct a brief review of incident tickets and system access logs to ensure staff are adhering to the new privacy and ethics policies.</w:t>
-            </w:r>
-          </w:p>
-        </w:tc>
-        <w:tc>
-          <w:tcPr>
-            <w:tcW w:w="547" w:type="pct"/>
+              <w:t>Verify that the system (cloud Drive/Intranet) is highly secure, confidential, and accessible only to authorised staff.</w:t>
+            </w:r>
+          </w:p>
+        </w:tc>
+        <w:tc>
+          <w:tcPr>
+            <w:tcW w:w="518" w:type="pct"/>
             <w:hideMark/>
           </w:tcPr>
           <w:p>
@@ -567,13 +556,13 @@
               <w:cnfStyle w:val="000000000000" w:firstRow="0" w:lastRow="0" w:firstColumn="0" w:lastColumn="0" w:oddVBand="0" w:evenVBand="0" w:oddHBand="0" w:evenHBand="0" w:firstRowFirstColumn="0" w:firstRowLastColumn="0" w:lastRowFirstColumn="0" w:lastRowLastColumn="0"/>
             </w:pPr>
             <w:r>
-              <w:t>Month 6 (Q2)</w:t>
-            </w:r>
-          </w:p>
-        </w:tc>
-        <w:tc>
-          <w:tcPr>
-            <w:tcW w:w="599" w:type="pct"/>
+              <w:t>Month 2</w:t>
+            </w:r>
+          </w:p>
+        </w:tc>
+        <w:tc>
+          <w:tcPr>
+            <w:tcW w:w="713" w:type="pct"/>
             <w:hideMark/>
           </w:tcPr>
           <w:p>
@@ -589,12 +578,12 @@
       <w:tr>
         <w:trPr>
           <w:cnfStyle w:val="000000100000" w:firstRow="0" w:lastRow="0" w:firstColumn="0" w:lastColumn="0" w:oddVBand="0" w:evenVBand="0" w:oddHBand="1" w:evenHBand="0" w:firstRowFirstColumn="0" w:firstRowLastColumn="0" w:lastRowFirstColumn="0" w:lastRowLastColumn="0"/>
-          <w:trHeight w:val="4780"/>
+          <w:trHeight w:val="4440"/>
         </w:trPr>
         <w:tc>
           <w:tcPr>
             <w:cnfStyle w:val="001000000000" w:firstRow="0" w:lastRow="0" w:firstColumn="1" w:lastColumn="0" w:oddVBand="0" w:evenVBand="0" w:oddHBand="0" w:evenHBand="0" w:firstRowFirstColumn="0" w:firstRowLastColumn="0" w:lastRowFirstColumn="0" w:lastRowLastColumn="0"/>
-            <w:tcW w:w="626" w:type="pct"/>
+            <w:tcW w:w="1544" w:type="pct"/>
             <w:tcBorders>
               <w:right w:val="none" w:sz="0" w:space="0" w:color="auto"/>
             </w:tcBorders>
@@ -602,13 +591,13 @@
           </w:tcPr>
           <w:p>
             <w:r>
-              <w:t>Epic 2: Bi-annual policy review and refinement against new legislative changes.</w:t>
-            </w:r>
-          </w:p>
-        </w:tc>
-        <w:tc>
-          <w:tcPr>
-            <w:tcW w:w="3228" w:type="pct"/>
+              <w:t>Epic 1: Quarterly compliance audit.</w:t>
+            </w:r>
+          </w:p>
+        </w:tc>
+        <w:tc>
+          <w:tcPr>
+            <w:tcW w:w="2225" w:type="pct"/>
             <w:hideMark/>
           </w:tcPr>
           <w:p>
@@ -616,13 +605,13 @@
               <w:cnfStyle w:val="000000100000" w:firstRow="0" w:lastRow="0" w:firstColumn="0" w:lastColumn="0" w:oddVBand="0" w:evenVBand="0" w:oddHBand="1" w:evenHBand="0" w:firstRowFirstColumn="0" w:firstRowLastColumn="0" w:lastRowFirstColumn="0" w:lastRowLastColumn="0"/>
             </w:pPr>
             <w:r>
-              <w:t>Review IP and privacy legislation updates. Refine the Product Backlog if changes are needed to the SOE (Standard Operating Environment).</w:t>
-            </w:r>
-          </w:p>
-        </w:tc>
-        <w:tc>
-          <w:tcPr>
-            <w:tcW w:w="547" w:type="pct"/>
+              <w:t>Conduct a brief review of incident tickets and system access logs to ensure staff are adhering to the new privacy and ethics policies.</w:t>
+            </w:r>
+          </w:p>
+        </w:tc>
+        <w:tc>
+          <w:tcPr>
+            <w:tcW w:w="518" w:type="pct"/>
             <w:hideMark/>
           </w:tcPr>
           <w:p>
@@ -630,13 +619,13 @@
               <w:cnfStyle w:val="000000100000" w:firstRow="0" w:lastRow="0" w:firstColumn="0" w:lastColumn="0" w:oddVBand="0" w:evenVBand="0" w:oddHBand="1" w:evenHBand="0" w:firstRowFirstColumn="0" w:firstRowLastColumn="0" w:lastRowFirstColumn="0" w:lastRowLastColumn="0"/>
             </w:pPr>
             <w:r>
-              <w:t>Month 9 (Q3)</w:t>
-            </w:r>
-          </w:p>
-        </w:tc>
-        <w:tc>
-          <w:tcPr>
-            <w:tcW w:w="599" w:type="pct"/>
+              <w:t>Month 6 (Q2)</w:t>
+            </w:r>
+          </w:p>
+        </w:tc>
+        <w:tc>
+          <w:tcPr>
+            <w:tcW w:w="713" w:type="pct"/>
             <w:hideMark/>
           </w:tcPr>
           <w:p>
@@ -651,12 +640,12 @@
       </w:tr>
       <w:tr>
         <w:trPr>
-          <w:trHeight w:val="5120"/>
+          <w:trHeight w:val="4780"/>
         </w:trPr>
         <w:tc>
           <w:tcPr>
             <w:cnfStyle w:val="001000000000" w:firstRow="0" w:lastRow="0" w:firstColumn="1" w:lastColumn="0" w:oddVBand="0" w:evenVBand="0" w:oddHBand="0" w:evenHBand="0" w:firstRowFirstColumn="0" w:firstRowLastColumn="0" w:lastRowFirstColumn="0" w:lastRowLastColumn="0"/>
-            <w:tcW w:w="626" w:type="pct"/>
+            <w:tcW w:w="1544" w:type="pct"/>
             <w:tcBorders>
               <w:right w:val="none" w:sz="0" w:space="0" w:color="auto"/>
             </w:tcBorders>
@@ -664,6 +653,69 @@
           </w:tcPr>
           <w:p>
             <w:r>
+              <w:t>Epic 2: Bi-annual policy review and refinement against new legislative changes.</w:t>
+            </w:r>
+          </w:p>
+        </w:tc>
+        <w:tc>
+          <w:tcPr>
+            <w:tcW w:w="2225" w:type="pct"/>
+            <w:hideMark/>
+          </w:tcPr>
+          <w:p>
+            <w:pPr>
+              <w:cnfStyle w:val="000000000000" w:firstRow="0" w:lastRow="0" w:firstColumn="0" w:lastColumn="0" w:oddVBand="0" w:evenVBand="0" w:oddHBand="0" w:evenHBand="0" w:firstRowFirstColumn="0" w:firstRowLastColumn="0" w:lastRowFirstColumn="0" w:lastRowLastColumn="0"/>
+            </w:pPr>
+            <w:r>
+              <w:t>Review IP and privacy legislation updates. Refine the Product Backlog if changes are needed to the SOE (Standard Operating Environment).</w:t>
+            </w:r>
+          </w:p>
+        </w:tc>
+        <w:tc>
+          <w:tcPr>
+            <w:tcW w:w="518" w:type="pct"/>
+            <w:hideMark/>
+          </w:tcPr>
+          <w:p>
+            <w:pPr>
+              <w:cnfStyle w:val="000000000000" w:firstRow="0" w:lastRow="0" w:firstColumn="0" w:lastColumn="0" w:oddVBand="0" w:evenVBand="0" w:oddHBand="0" w:evenHBand="0" w:firstRowFirstColumn="0" w:firstRowLastColumn="0" w:lastRowFirstColumn="0" w:lastRowLastColumn="0"/>
+            </w:pPr>
+            <w:r>
+              <w:t>Month 9 (Q3)</w:t>
+            </w:r>
+          </w:p>
+        </w:tc>
+        <w:tc>
+          <w:tcPr>
+            <w:tcW w:w="713" w:type="pct"/>
+            <w:hideMark/>
+          </w:tcPr>
+          <w:p>
+            <w:pPr>
+              <w:cnfStyle w:val="000000000000" w:firstRow="0" w:lastRow="0" w:firstColumn="0" w:lastColumn="0" w:oddVBand="0" w:evenVBand="0" w:oddHBand="0" w:evenHBand="0" w:firstRowFirstColumn="0" w:firstRowLastColumn="0" w:lastRowFirstColumn="0" w:lastRowLastColumn="0"/>
+            </w:pPr>
+            <w:r>
+              <w:t>No</w:t>
+            </w:r>
+          </w:p>
+        </w:tc>
+      </w:tr>
+      <w:tr>
+        <w:trPr>
+          <w:cnfStyle w:val="000000100000" w:firstRow="0" w:lastRow="0" w:firstColumn="0" w:lastColumn="0" w:oddVBand="0" w:evenVBand="0" w:oddHBand="1" w:evenHBand="0" w:firstRowFirstColumn="0" w:firstRowLastColumn="0" w:lastRowFirstColumn="0" w:lastRowLastColumn="0"/>
+          <w:trHeight w:val="5120"/>
+        </w:trPr>
+        <w:tc>
+          <w:tcPr>
+            <w:cnfStyle w:val="001000000000" w:firstRow="0" w:lastRow="0" w:firstColumn="1" w:lastColumn="0" w:oddVBand="0" w:evenVBand="0" w:oddHBand="0" w:evenHBand="0" w:firstRowFirstColumn="0" w:firstRowLastColumn="0" w:lastRowFirstColumn="0" w:lastRowLastColumn="0"/>
+            <w:tcW w:w="1544" w:type="pct"/>
+            <w:tcBorders>
+              <w:right w:val="none" w:sz="0" w:space="0" w:color="auto"/>
+            </w:tcBorders>
+            <w:hideMark/>
+          </w:tcPr>
+          <w:p>
+            <w:r>
               <w:lastRenderedPageBreak/>
               <w:t>Epic 3: Annual Retrospective and comprehensive staff refresher training.</w:t>
             </w:r>
@@ -671,12 +723,12 @@
         </w:tc>
         <w:tc>
           <w:tcPr>
-            <w:tcW w:w="3228" w:type="pct"/>
-            <w:hideMark/>
-          </w:tcPr>
-          <w:p>
-            <w:pPr>
-              <w:cnfStyle w:val="000000000000" w:firstRow="0" w:lastRow="0" w:firstColumn="0" w:lastColumn="0" w:oddVBand="0" w:evenVBand="0" w:oddHBand="0" w:evenHBand="0" w:firstRowFirstColumn="0" w:firstRowLastColumn="0" w:lastRowFirstColumn="0" w:lastRowLastColumn="0"/>
+            <w:tcW w:w="2225" w:type="pct"/>
+            <w:hideMark/>
+          </w:tcPr>
+          <w:p>
+            <w:pPr>
+              <w:cnfStyle w:val="000000100000" w:firstRow="0" w:lastRow="0" w:firstColumn="0" w:lastColumn="0" w:oddVBand="0" w:evenVBand="0" w:oddHBand="1" w:evenHBand="0" w:firstRowFirstColumn="0" w:firstRowLastColumn="0" w:lastRowFirstColumn="0" w:lastRowLastColumn="0"/>
               <w:rPr>
                 <w:b/>
                 <w:bCs/>
@@ -696,12 +748,12 @@
         </w:tc>
         <w:tc>
           <w:tcPr>
-            <w:tcW w:w="547" w:type="pct"/>
-            <w:hideMark/>
-          </w:tcPr>
-          <w:p>
-            <w:pPr>
-              <w:cnfStyle w:val="000000000000" w:firstRow="0" w:lastRow="0" w:firstColumn="0" w:lastColumn="0" w:oddVBand="0" w:evenVBand="0" w:oddHBand="0" w:evenHBand="0" w:firstRowFirstColumn="0" w:firstRowLastColumn="0" w:lastRowFirstColumn="0" w:lastRowLastColumn="0"/>
+            <w:tcW w:w="518" w:type="pct"/>
+            <w:hideMark/>
+          </w:tcPr>
+          <w:p>
+            <w:pPr>
+              <w:cnfStyle w:val="000000100000" w:firstRow="0" w:lastRow="0" w:firstColumn="0" w:lastColumn="0" w:oddVBand="0" w:evenVBand="0" w:oddHBand="1" w:evenHBand="0" w:firstRowFirstColumn="0" w:firstRowLastColumn="0" w:lastRowFirstColumn="0" w:lastRowLastColumn="0"/>
             </w:pPr>
             <w:r>
               <w:t>Month 12 (Q4)</w:t>
@@ -710,12 +762,12 @@
         </w:tc>
         <w:tc>
           <w:tcPr>
-            <w:tcW w:w="599" w:type="pct"/>
-            <w:hideMark/>
-          </w:tcPr>
-          <w:p>
-            <w:pPr>
-              <w:cnfStyle w:val="000000000000" w:firstRow="0" w:lastRow="0" w:firstColumn="0" w:lastColumn="0" w:oddVBand="0" w:evenVBand="0" w:oddHBand="0" w:evenHBand="0" w:firstRowFirstColumn="0" w:firstRowLastColumn="0" w:lastRowFirstColumn="0" w:lastRowLastColumn="0"/>
+            <w:tcW w:w="713" w:type="pct"/>
+            <w:hideMark/>
+          </w:tcPr>
+          <w:p>
+            <w:pPr>
+              <w:cnfStyle w:val="000000100000" w:firstRow="0" w:lastRow="0" w:firstColumn="0" w:lastColumn="0" w:oddVBand="0" w:evenVBand="0" w:oddHBand="1" w:evenHBand="0" w:firstRowFirstColumn="0" w:firstRowLastColumn="0" w:lastRowFirstColumn="0" w:lastRowLastColumn="0"/>
             </w:pPr>
             <w:r>
               <w:t>No</w:t>

</xml_diff>